<commit_message>
Configure H2 database and fix SQL initialization
</commit_message>
<xml_diff>
--- a/Retomo el proyecto de homes.docx
+++ b/Retomo el proyecto de homes.docx
@@ -199,13 +199,7 @@
         <w:rPr>
           <w:lang w:val="es-ES"/>
         </w:rPr>
-        <w:t xml:space="preserve"> que tienes abierta. </w:t>
-      </w:r>
-      <w:r>
-        <w:rPr>
-          <w:lang w:val="es-ES"/>
-        </w:rPr>
-        <w:t xml:space="preserve"> </w:t>
+        <w:t xml:space="preserve"> que tienes abierta.  </w:t>
       </w:r>
       <w:r>
         <w:rPr>
@@ -263,7 +257,7 @@
         <w:rPr>
           <w:lang w:val="es-ES"/>
         </w:rPr>
-        <w:t xml:space="preserve">: Es una aplicación para buscar, visualizar y gestionar ubicaciones de vivienda. Los usuarios pueden ver una lista de casas o apartamentos disponibles, consultar detalles de cada uno (como ubicación, precio, fotos, etc.), y posiblemente aplicar a una vivienda mediante un formulario. Es un CRUD básico (Crear, Leer, Actualizar, Eliminar) para datos de </w:t>
+        <w:t xml:space="preserve">: Es una aplicación para buscar, visualizar y gestionar ubicaciones de vivienda. Los usuarios pueden ver una lista de casas o apartamentos disponibles, consultar detalles de cada uno (como ubicación, precio, fotos, etc.), y aplicar a una vivienda mediante un formulario. Es un CRUD básico (Crear, Leer, Actualizar, Eliminar) para datos de </w:t>
       </w:r>
       <w:proofErr w:type="spellStart"/>
       <w:r>
@@ -658,7 +652,6 @@
           <w:b/>
           <w:bCs/>
         </w:rPr>
-        <w:lastRenderedPageBreak/>
         <w:t>Tecnologías</w:t>
       </w:r>
       <w:proofErr w:type="spellEnd"/>
@@ -702,6 +695,7 @@
           <w:bCs/>
           <w:lang w:val="es-ES"/>
         </w:rPr>
+        <w:lastRenderedPageBreak/>
         <w:t>Backend</w:t>
       </w:r>
       <w:proofErr w:type="spellEnd"/>
@@ -1433,21 +1427,21 @@
           <w:bCs/>
           <w:lang w:val="es-ES"/>
         </w:rPr>
+        <w:t>¿Cómo está estructurado?</w:t>
+      </w:r>
+    </w:p>
+    <w:p>
+      <w:pPr>
+        <w:jc w:val="both"/>
+        <w:rPr>
+          <w:lang w:val="es-ES"/>
+        </w:rPr>
+      </w:pPr>
+      <w:r>
+        <w:rPr>
+          <w:lang w:val="es-ES"/>
+        </w:rPr>
         <w:lastRenderedPageBreak/>
-        <w:t>¿Cómo está estructurado?</w:t>
-      </w:r>
-    </w:p>
-    <w:p>
-      <w:pPr>
-        <w:jc w:val="both"/>
-        <w:rPr>
-          <w:lang w:val="es-ES"/>
-        </w:rPr>
-      </w:pPr>
-      <w:r>
-        <w:rPr>
-          <w:lang w:val="es-ES"/>
-        </w:rPr>
         <w:t>El proyecto sigue una arquitectura típica de full-</w:t>
       </w:r>
       <w:proofErr w:type="spellStart"/>
@@ -2192,43 +2186,43 @@
         <w:rPr>
           <w:lang w:val="en-US"/>
         </w:rPr>
+        <w:t>src</w:t>
+      </w:r>
+      <w:proofErr w:type="spellEnd"/>
+      <w:r>
+        <w:rPr>
+          <w:lang w:val="en-US"/>
+        </w:rPr>
+        <w:t xml:space="preserve">/test/java/: Tests </w:t>
+      </w:r>
+      <w:proofErr w:type="spellStart"/>
+      <w:r>
+        <w:rPr>
+          <w:lang w:val="en-US"/>
+        </w:rPr>
+        <w:t>unitarios</w:t>
+      </w:r>
+      <w:proofErr w:type="spellEnd"/>
+      <w:r>
+        <w:rPr>
+          <w:lang w:val="en-US"/>
+        </w:rPr>
+        <w:t xml:space="preserve"> </w:t>
+      </w:r>
+    </w:p>
+    <w:p>
+      <w:pPr>
+        <w:ind w:left="1440"/>
+        <w:jc w:val="both"/>
+        <w:rPr>
+          <w:lang w:val="en-US"/>
+        </w:rPr>
+      </w:pPr>
+      <w:r>
+        <w:rPr>
+          <w:lang w:val="en-US"/>
+        </w:rPr>
         <w:lastRenderedPageBreak/>
-        <w:t>src</w:t>
-      </w:r>
-      <w:proofErr w:type="spellEnd"/>
-      <w:r>
-        <w:rPr>
-          <w:lang w:val="en-US"/>
-        </w:rPr>
-        <w:t xml:space="preserve">/test/java/: Tests </w:t>
-      </w:r>
-      <w:proofErr w:type="spellStart"/>
-      <w:r>
-        <w:rPr>
-          <w:lang w:val="en-US"/>
-        </w:rPr>
-        <w:t>unitarios</w:t>
-      </w:r>
-      <w:proofErr w:type="spellEnd"/>
-      <w:r>
-        <w:rPr>
-          <w:lang w:val="en-US"/>
-        </w:rPr>
-        <w:t xml:space="preserve"> </w:t>
-      </w:r>
-    </w:p>
-    <w:p>
-      <w:pPr>
-        <w:ind w:left="1440"/>
-        <w:jc w:val="both"/>
-        <w:rPr>
-          <w:lang w:val="en-US"/>
-        </w:rPr>
-      </w:pPr>
-      <w:r>
-        <w:rPr>
-          <w:lang w:val="en-US"/>
-        </w:rPr>
         <w:t>(e.g., MyBackendApplicationTests.java).</w:t>
       </w:r>
     </w:p>
@@ -2721,16 +2715,34 @@
           <w:numId w:val="6"/>
         </w:numPr>
       </w:pPr>
-      <w:r>
-        <w:t>app-</w:t>
-      </w:r>
-      <w:proofErr w:type="spellStart"/>
-      <w:r>
-        <w:t>routing.module.ts</w:t>
-      </w:r>
-      <w:proofErr w:type="spellEnd"/>
-      <w:r>
-        <w:t xml:space="preserve">: </w:t>
+      <w:proofErr w:type="gramStart"/>
+      <w:r>
+        <w:t>app</w:t>
+      </w:r>
+      <w:proofErr w:type="gramEnd"/>
+      <w:r>
+        <w:t>-</w:t>
+      </w:r>
+      <w:proofErr w:type="spellStart"/>
+      <w:proofErr w:type="gramStart"/>
+      <w:r>
+        <w:t>routing.module</w:t>
+      </w:r>
+      <w:proofErr w:type="gramEnd"/>
+      <w:r>
+        <w:t>.</w:t>
+      </w:r>
+      <w:proofErr w:type="gramStart"/>
+      <w:r>
+        <w:t>ts</w:t>
+      </w:r>
+      <w:proofErr w:type="spellEnd"/>
+      <w:r>
+        <w:t>:</w:t>
+      </w:r>
+      <w:proofErr w:type="gramEnd"/>
+      <w:r>
+        <w:t xml:space="preserve"> </w:t>
       </w:r>
       <w:proofErr w:type="spellStart"/>
       <w:r>
@@ -2941,7 +2953,6 @@
       <w:proofErr w:type="spellStart"/>
       <w:proofErr w:type="gramStart"/>
       <w:r>
-        <w:lastRenderedPageBreak/>
         <w:t>housing</w:t>
       </w:r>
       <w:proofErr w:type="spellEnd"/>
@@ -3011,6 +3022,7 @@
       <w:proofErr w:type="spellStart"/>
       <w:proofErr w:type="gramStart"/>
       <w:r>
+        <w:lastRenderedPageBreak/>
         <w:t>apply-form</w:t>
       </w:r>
       <w:proofErr w:type="spellEnd"/>
@@ -3157,11 +3169,19 @@
       </w:r>
       <w:proofErr w:type="spellStart"/>
       <w:r>
-        <w:t>housing.service.ts</w:t>
-      </w:r>
-      <w:proofErr w:type="spellEnd"/>
-      <w:r>
-        <w:t xml:space="preserve">: </w:t>
+        <w:t>housing.service.</w:t>
+      </w:r>
+      <w:proofErr w:type="gramStart"/>
+      <w:r>
+        <w:t>ts</w:t>
+      </w:r>
+      <w:proofErr w:type="spellEnd"/>
+      <w:r>
+        <w:t>:</w:t>
+      </w:r>
+      <w:proofErr w:type="gramEnd"/>
+      <w:r>
+        <w:t xml:space="preserve"> </w:t>
       </w:r>
       <w:proofErr w:type="spellStart"/>
       <w:r>
@@ -5547,6 +5567,7 @@
   <w:style w:type="character" w:default="1" w:styleId="DefaultParagraphFont">
     <w:name w:val="Default Paragraph Font"/>
     <w:uiPriority w:val="1"/>
+    <w:semiHidden/>
     <w:unhideWhenUsed/>
   </w:style>
   <w:style w:type="table" w:default="1" w:styleId="TableNormal">

</xml_diff>